<commit_message>
Updated user manual (2)
</commit_message>
<xml_diff>
--- a/User Manual.docx
+++ b/User Manual.docx
@@ -7614,7 +7614,13 @@
         <w:t xml:space="preserve"> or</w:t>
       </w:r>
       <w:r>
-        <w:t xml:space="preserve"> a PDF. Cards show a preview, filename, description, date and file size. Click a media item to open </w:t>
+        <w:t xml:space="preserve"> a PDF. </w:t>
+      </w:r>
+      <w:r>
+        <w:t xml:space="preserve"> </w:t>
+      </w:r>
+      <w:r>
+        <w:t xml:space="preserve">Cards show a preview, filename, description, date and file size. Click a media item to open </w:t>
       </w:r>
       <w:r>
         <w:t>and/or</w:t>
@@ -8515,7 +8521,13 @@
         <w:t>Add [record type]</w:t>
       </w:r>
       <w:r>
-        <w:t xml:space="preserve"> button in the top-right corner. This opens a form where the details of the new record can be entered. Fill in the required fields and, if needed, complete any optional fields or expandable sections further down the page.</w:t>
+        <w:t xml:space="preserve"> button in the top-right corner. </w:t>
+      </w:r>
+      <w:r>
+        <w:t xml:space="preserve">            </w:t>
+      </w:r>
+      <w:r>
+        <w:t>This opens a form where the details of the new record can be entered. Fill in the required fields and, if needed, complete any optional fields or expandable sections further down the page.</w:t>
       </w:r>
     </w:p>
     <w:p>
@@ -8839,7 +8851,17 @@
     </w:p>
     <w:p>
       <w:r>
-        <w:t>When choosing Delete selected [record type], the admin panel will show a confirmation page listing the selected records and any related objects that may also be affected. Review this information carefully before confirming the deletion.</w:t>
+        <w:t xml:space="preserve">When choosing </w:t>
+      </w:r>
+      <w:r>
+        <w:rPr>
+          <w:b/>
+          <w:bCs/>
+        </w:rPr>
+        <w:t>Delete selected [record type]</w:t>
+      </w:r>
+      <w:r>
+        <w:t>, the admin panel will show a confirmation page listing the selected records and any related objects that may also be affected. Review this information carefully before confirming the deletion.</w:t>
       </w:r>
     </w:p>
     <w:p>
@@ -9126,30 +9148,98 @@
       </w:r>
       <w:proofErr w:type="spellEnd"/>
       <w:r>
-        <w:t xml:space="preserve"> documentation is available at /</w:t>
+        <w:t xml:space="preserve"> documentation is available at </w:t>
+      </w:r>
+      <w:hyperlink r:id="rId30" w:history="1">
+        <w:r>
+          <w:rPr>
+            <w:rStyle w:val="Hyperlink"/>
+          </w:rPr>
+          <w:t>/</w:t>
+        </w:r>
+        <w:proofErr w:type="spellStart"/>
+        <w:r>
+          <w:rPr>
+            <w:rStyle w:val="Hyperlink"/>
+          </w:rPr>
+          <w:t>api</w:t>
+        </w:r>
+        <w:proofErr w:type="spellEnd"/>
+        <w:r>
+          <w:rPr>
+            <w:rStyle w:val="Hyperlink"/>
+          </w:rPr>
+          <w:t>/docs/</w:t>
+        </w:r>
+      </w:hyperlink>
+      <w:r>
+        <w:t>. This interactive documentation page provides an overview of the available API endpoints, request parameters and response structures. It can also be used to test API requests directly from the browser when the required API key is available.</w:t>
+      </w:r>
+    </w:p>
+    <w:p>
+      <w:r>
+        <w:lastRenderedPageBreak/>
+        <w:t xml:space="preserve">The </w:t>
       </w:r>
       <w:proofErr w:type="spellStart"/>
       <w:r>
-        <w:t>api</w:t>
+        <w:t>ReDoc</w:t>
       </w:r>
       <w:proofErr w:type="spellEnd"/>
       <w:r>
-        <w:t>/docs/. It provides an interactive overview of the available API endpoints, request parameters and response structures.</w:t>
-      </w:r>
-    </w:p>
-    <w:p>
-      <w:r>
-        <w:t>When using the API documentation, make sure that you have the required API key.</w:t>
-      </w:r>
-      <w:r>
-        <w:t xml:space="preserve">            </w:t>
-      </w:r>
-      <w:r>
-        <w:t xml:space="preserve"> API requests must include the X-API-Key header. Public API keys are intended for read-</w:t>
-      </w:r>
-      <w:r>
-        <w:lastRenderedPageBreak/>
-        <w:t>only access, while internal API keys can be used for administrative or server-to-server actions.</w:t>
+        <w:t xml:space="preserve"> documentation is available at </w:t>
+      </w:r>
+      <w:hyperlink r:id="rId31" w:history="1">
+        <w:r>
+          <w:rPr>
+            <w:rStyle w:val="Hyperlink"/>
+          </w:rPr>
+          <w:t>/</w:t>
+        </w:r>
+        <w:proofErr w:type="spellStart"/>
+        <w:r>
+          <w:rPr>
+            <w:rStyle w:val="Hyperlink"/>
+          </w:rPr>
+          <w:t>api</w:t>
+        </w:r>
+        <w:proofErr w:type="spellEnd"/>
+        <w:r>
+          <w:rPr>
+            <w:rStyle w:val="Hyperlink"/>
+          </w:rPr>
+          <w:t>/</w:t>
+        </w:r>
+        <w:proofErr w:type="spellStart"/>
+        <w:r>
+          <w:rPr>
+            <w:rStyle w:val="Hyperlink"/>
+          </w:rPr>
+          <w:t>redoc</w:t>
+        </w:r>
+        <w:proofErr w:type="spellEnd"/>
+        <w:r>
+          <w:rPr>
+            <w:rStyle w:val="Hyperlink"/>
+          </w:rPr>
+          <w:t>/</w:t>
+        </w:r>
+      </w:hyperlink>
+      <w:r>
+        <w:t xml:space="preserve">. </w:t>
+      </w:r>
+      <w:proofErr w:type="spellStart"/>
+      <w:r>
+        <w:t>ReDoc</w:t>
+      </w:r>
+      <w:proofErr w:type="spellEnd"/>
+      <w:r>
+        <w:t xml:space="preserve"> presents the same API schema in a more readable, documentation-focused layout. It is useful when users want to browse the API structure, inspect models and read endpoint descriptions without using the interactive “try it out” functionality.</w:t>
+      </w:r>
+    </w:p>
+    <w:p>
+      <w:r>
+        <w:t>When using the API documentation, make sure that you have the required API key. API requests must include the X-API-Key header. Public API keys are intended for read-only access, while internal API keys can be used for administrative or server-to-server actions.</w:t>
       </w:r>
     </w:p>
     <w:p>
@@ -9549,7 +9639,7 @@
     </w:p>
     <w:p/>
     <w:sectPr>
-      <w:footerReference w:type="default" r:id="rId30"/>
+      <w:footerReference w:type="default" r:id="rId32"/>
       <w:pgSz w:w="11906" w:h="16838"/>
       <w:pgMar w:top="1417" w:right="1417" w:bottom="1417" w:left="1417" w:header="708" w:footer="708" w:gutter="0"/>
       <w:pgNumType w:start="1"/>

</xml_diff>